<commit_message>
Update Results section, add flux profiles figure to textbook chapter
- plot_results.py: add plot_flux_profiles() showing O2 diffusion flux and
  solid/ionic current-sharing along the CL; demonstrates face-centred FV
  fluxes and charge conservation pedagogically
- stage1_flux_profiles.png: generated figure
- Python_for_Multiphysics_Outline_edited.docx: Results section corrections
    * Para 1: remove incorrect "linear ohmic-loss region" — Stage 1 is
      kinetically dominated (<3 mA/cm², ohmic contributions <0.1%)
    * Para 3: fix diffusivity ratio to reference effective CL gas-phase
      diffusivity (6.9e-6 m2/s) vs effective ionomer (1.27e-10 m2/s) giving
      the correct 54,000x factor (not bulk 3.5e-5 which would be 276,000x)
  Insert all 5 model figures with captions into Results section

https://claude.ai/code/session_012yGGMV6iaXGRq7okqrxmoY
</commit_message>
<xml_diff>
--- a/Python_for_Multiphysics_Outline_edited.docx
+++ b/Python_for_Multiphysics_Outline_edited.docx
@@ -19152,7 +19152,261 @@
           <w:i/>
           <w:iCs/>
         </w:rPr>
-        <w:t>(Figures to be inserted: stage1_polarization.png, stage1_profiles.png, stage1_ir_breakdown.png, stage3_results.png)</w:t>
+      </w:r>
+    </w:p>
+    <w:p>
+      <w:pPr>
+        <w:jc w:val="center"/>
+      </w:pPr>
+      <w:r>
+        <w:drawing>
+          <wp:inline xmlns:a="http://schemas.openxmlformats.org/drawingml/2006/main" xmlns:pic="http://schemas.openxmlformats.org/drawingml/2006/picture">
+            <wp:extent cx="2971800" cy="2271259"/>
+            <wp:docPr id="909377636" name="Picture 909377636"/>
+            <wp:cNvGraphicFramePr>
+              <a:graphicFrameLocks noChangeAspect="1"/>
+            </wp:cNvGraphicFramePr>
+            <a:graphic>
+              <a:graphicData uri="http://schemas.openxmlformats.org/drawingml/2006/picture">
+                <pic:pic>
+                  <pic:nvPicPr>
+                    <pic:cNvPr id="0" name="stage1_polarization.png"/>
+                    <pic:cNvPicPr/>
+                  </pic:nvPicPr>
+                  <pic:blipFill>
+                    <a:blip r:embed="rId20"/>
+                    <a:stretch>
+                      <a:fillRect/>
+                    </a:stretch>
+                  </pic:blipFill>
+                  <pic:spPr>
+                    <a:xfrm>
+                      <a:off x="0" y="0"/>
+                      <a:ext cx="2971800" cy="2271259"/>
+                    </a:xfrm>
+                    <a:prstGeom prst="rect"/>
+                  </pic:spPr>
+                </pic:pic>
+              </a:graphicData>
+            </a:graphic>
+          </wp:inline>
+        </w:drawing>
+      </w:r>
+    </w:p>
+    <w:p>
+      <w:pPr>
+        <w:jc w:val="center"/>
+      </w:pPr>
+      <w:r>
+        <w:rPr>
+          <w:i/>
+          <w:sz w:val="16"/>
+        </w:rPr>
+        <w:t>Figure: Stage 1 polarization curve (V_cathode vs. J). The steep near-OCV drop is governed by Tafel kinetics; the mild mass-transport tail reflects ionomer-phase O2 depletion near the membrane.</w:t>
+      </w:r>
+    </w:p>
+    <w:p>
+      <w:pPr>
+        <w:jc w:val="center"/>
+      </w:pPr>
+      <w:r>
+        <w:drawing>
+          <wp:inline xmlns:a="http://schemas.openxmlformats.org/drawingml/2006/main" xmlns:pic="http://schemas.openxmlformats.org/drawingml/2006/picture">
+            <wp:extent cx="5029200" cy="4822146"/>
+            <wp:docPr id="909377635" name="Picture 909377635"/>
+            <wp:cNvGraphicFramePr>
+              <a:graphicFrameLocks noChangeAspect="1"/>
+            </wp:cNvGraphicFramePr>
+            <a:graphic>
+              <a:graphicData uri="http://schemas.openxmlformats.org/drawingml/2006/picture">
+                <pic:pic>
+                  <pic:nvPicPr>
+                    <pic:cNvPr id="0" name="stage1_profiles.png"/>
+                    <pic:cNvPicPr/>
+                  </pic:nvPicPr>
+                  <pic:blipFill>
+                    <a:blip r:embed="rId19"/>
+                    <a:stretch>
+                      <a:fillRect/>
+                    </a:stretch>
+                  </pic:blipFill>
+                  <pic:spPr>
+                    <a:xfrm>
+                      <a:off x="0" y="0"/>
+                      <a:ext cx="5029200" cy="4822146"/>
+                    </a:xfrm>
+                    <a:prstGeom prst="rect"/>
+                  </pic:spPr>
+                </pic:pic>
+              </a:graphicData>
+            </a:graphic>
+          </wp:inline>
+        </w:drawing>
+      </w:r>
+    </w:p>
+    <w:p>
+      <w:pPr>
+        <w:jc w:val="center"/>
+      </w:pPr>
+      <w:r>
+        <w:rPr>
+          <w:i/>
+          <w:sz w:val="16"/>
+        </w:rPr>
+        <w:t>Figure: Stage 1 spatial profiles at four sampled voltages. (a) O2 concentration; (b) ionic potential φ_L (mV); (c) solid potential φ_s; (d) kinetic overpotential η = (φ_s − φ_L) − U_eq (mV). Dark curves correspond to higher overpotential; at high overpotential the reaction is concentrated near the GDL/CL interface (x = 0).</w:t>
+      </w:r>
+    </w:p>
+    <w:p>
+      <w:pPr>
+        <w:jc w:val="center"/>
+      </w:pPr>
+      <w:r>
+        <w:drawing>
+          <wp:inline xmlns:a="http://schemas.openxmlformats.org/drawingml/2006/main" xmlns:pic="http://schemas.openxmlformats.org/drawingml/2006/picture">
+            <wp:extent cx="5029200" cy="1880711"/>
+            <wp:docPr id="909377634" name="Picture 909377634"/>
+            <wp:cNvGraphicFramePr>
+              <a:graphicFrameLocks noChangeAspect="1"/>
+            </wp:cNvGraphicFramePr>
+            <a:graphic>
+              <a:graphicData uri="http://schemas.openxmlformats.org/drawingml/2006/picture">
+                <pic:pic>
+                  <pic:nvPicPr>
+                    <pic:cNvPr id="0" name="stage1_ir_breakdown.png"/>
+                    <pic:cNvPicPr/>
+                  </pic:nvPicPr>
+                  <pic:blipFill>
+                    <a:blip r:embed="rId18"/>
+                    <a:stretch>
+                      <a:fillRect/>
+                    </a:stretch>
+                  </pic:blipFill>
+                  <pic:spPr>
+                    <a:xfrm>
+                      <a:off x="0" y="0"/>
+                      <a:ext cx="5029200" cy="1880711"/>
+                    </a:xfrm>
+                    <a:prstGeom prst="rect"/>
+                  </pic:spPr>
+                </pic:pic>
+              </a:graphicData>
+            </a:graphic>
+          </wp:inline>
+        </w:drawing>
+      </w:r>
+    </w:p>
+    <w:p>
+      <w:pPr>
+        <w:jc w:val="center"/>
+      </w:pPr>
+      <w:r>
+        <w:rPr>
+          <w:i/>
+          <w:sz w:val="16"/>
+        </w:rPr>
+        <w:t>Figure: Voltage-loss breakdown for Stage 1. Left: stacked-area decomposition showing kinetic overpotential accounting for &gt;99% of total loss. Right: ohmic losses on an expanded millivolt scale; ionic (Nafion) resistance exceeds solid (carbon) resistance by ~27×, though both are negligible at Stage 1 currents.</w:t>
+      </w:r>
+    </w:p>
+    <w:p>
+      <w:pPr>
+        <w:jc w:val="center"/>
+      </w:pPr>
+      <w:r>
+        <w:drawing>
+          <wp:inline xmlns:a="http://schemas.openxmlformats.org/drawingml/2006/main" xmlns:pic="http://schemas.openxmlformats.org/drawingml/2006/picture">
+            <wp:extent cx="5029200" cy="1882533"/>
+            <wp:docPr id="909377633" name="Picture 909377633"/>
+            <wp:cNvGraphicFramePr>
+              <a:graphicFrameLocks noChangeAspect="1"/>
+            </wp:cNvGraphicFramePr>
+            <a:graphic>
+              <a:graphicData uri="http://schemas.openxmlformats.org/drawingml/2006/picture">
+                <pic:pic>
+                  <pic:nvPicPr>
+                    <pic:cNvPr id="0" name="stage1_flux_profiles.png"/>
+                    <pic:cNvPicPr/>
+                  </pic:nvPicPr>
+                  <pic:blipFill>
+                    <a:blip r:embed="rId17"/>
+                    <a:stretch>
+                      <a:fillRect/>
+                    </a:stretch>
+                  </pic:blipFill>
+                  <pic:spPr>
+                    <a:xfrm>
+                      <a:off x="0" y="0"/>
+                      <a:ext cx="5029200" cy="1882533"/>
+                    </a:xfrm>
+                    <a:prstGeom prst="rect"/>
+                  </pic:spPr>
+                </pic:pic>
+              </a:graphicData>
+            </a:graphic>
+          </wp:inline>
+        </w:drawing>
+      </w:r>
+    </w:p>
+    <w:p>
+      <w:pPr>
+        <w:jc w:val="center"/>
+      </w:pPr>
+      <w:r>
+        <w:rPr>
+          <w:i/>
+          <w:sz w:val="16"/>
+        </w:rPr>
+        <w:t>Figure: Face-centred flux profiles at sampled voltages. Left: O2 diffusion flux J_O2(x) entering at the GDL face (x = 0) and falling to zero at the no-flux membrane face (x = L_CL). Right: solid-phase i_s (solid lines) and ionic-phase i_L (dashed lines) current densities; i_s decreases and i_L grows across the CL so their sum equals i_total everywhere, illustrating charge conservation.</w:t>
+      </w:r>
+    </w:p>
+    <w:p>
+      <w:pPr>
+        <w:jc w:val="center"/>
+      </w:pPr>
+      <w:r>
+        <w:drawing>
+          <wp:inline xmlns:a="http://schemas.openxmlformats.org/drawingml/2006/main" xmlns:pic="http://schemas.openxmlformats.org/drawingml/2006/picture">
+            <wp:extent cx="5029200" cy="1579795"/>
+            <wp:docPr id="909377632" name="Picture 909377632"/>
+            <wp:cNvGraphicFramePr>
+              <a:graphicFrameLocks noChangeAspect="1"/>
+            </wp:cNvGraphicFramePr>
+            <a:graphic>
+              <a:graphicData uri="http://schemas.openxmlformats.org/drawingml/2006/picture">
+                <pic:pic>
+                  <pic:nvPicPr>
+                    <pic:cNvPr id="0" name="stage3_results.png"/>
+                    <pic:cNvPicPr/>
+                  </pic:nvPicPr>
+                  <pic:blipFill>
+                    <a:blip r:embed="rId16"/>
+                    <a:stretch>
+                      <a:fillRect/>
+                    </a:stretch>
+                  </pic:blipFill>
+                  <pic:spPr>
+                    <a:xfrm>
+                      <a:off x="0" y="0"/>
+                      <a:ext cx="5029200" cy="1579795"/>
+                    </a:xfrm>
+                    <a:prstGeom prst="rect"/>
+                  </pic:spPr>
+                </pic:pic>
+              </a:graphicData>
+            </a:graphic>
+          </wp:inline>
+        </w:drawing>
+      </w:r>
+    </w:p>
+    <w:p>
+      <w:pPr>
+        <w:jc w:val="center"/>
+      </w:pPr>
+      <w:r>
+        <w:rPr>
+          <w:i/>
+          <w:sz w:val="16"/>
+        </w:rPr>
+        <w:t>Figure: Stage 3 results. Stage 1 vs. Stage 3 polarization curves and O2 concentration profiles. Gas-phase transport in the GDL and CL pores extends the achievable current density to hundreds of mA/cm², the realistic operating range for an air-fed PEMFC cathode.</w:t>
       </w:r>
     </w:p>
     <w:p>
@@ -19166,7 +19420,7 @@
         <w:rPr>
           <w:rFonts w:ascii="Times New Roman" w:hAnsi="Times New Roman" w:cs="Times New Roman"/>
         </w:rPr>
-        <w:t>The Stage 1 polarization curve shows three characteristic regimes: a steep near-OCV drop dominated by kinetic overpotential, a linear ohmic-loss region at intermediate current densities, and a gradual mass-transport tail as O₂ is depleted near the membrane. Spatial profiles at several voltages reveal that at high overpotential the reaction is localized near the GDL/CL interface — O₂ is consumed before it can penetrate deep into the CL.</w:t>
+        <w:t>The Stage 1 polarization curve shows two characteristic regimes: a steep near-OCV drop dominated by Tafel kinetics, and a gradual mass-transport tail at higher current densities as O₂ is depleted near the membrane. Stage 1 currents do not exceed ~3 mA/cm², at which ionic and solid-phase ohmic losses combined remain below 0.1% of the total overpotential — there is no discernible ohmic regime at this scale, consistent with the IR breakdown figure. Spatial profiles at several voltages reveal that at high overpotential the reaction is localized near the GDL/CL interface — O₂ is consumed before it can penetrate deep into the CL.</w:t>
       </w:r>
     </w:p>
     <w:p>
@@ -19191,7 +19445,7 @@
         <w:rPr>
           <w:rFonts w:ascii="Times New Roman" w:hAnsi="Times New Roman" w:cs="Times New Roman"/>
         </w:rPr>
-        <w:t>Stage 3 introduces gas-phase transport in the GDL and CL pores. Because the gas-phase diffusivity (</w:t>
+        <w:t>Stage 3 introduces gas-phase transport in the GDL and CL pores. Because the effective gas-phase diffusivity in the CL pores (</w:t>
       </w:r>
       <m:oMath>
         <m:sSub>
@@ -19342,7 +19596,7 @@
         <w:rPr>
           <w:rFonts w:ascii="Times New Roman" w:hAnsi="Times New Roman" w:cs="Times New Roman"/>
         </w:rPr>
-        <w:t>) is approximately 54,000 times larger than the ionomer-phase diffusivity, Stage 3 currents reach hundreds of mA/cm² before mass-transport limitation becomes apparent — a realistic prediction for an air-fed PEMFC cathode.</w:t>
+        <w:t>≈6.9×10⁻⁶ m²/s) is approximately 54,000 times larger than the effective ionomer diffusivity (≈1.27×10⁻¹⁰ m²/s), Stage 3 currents reach hundreds of mA/cm² before mass-transport limitation becomes apparent — a realistic prediction for an air-fed PEMFC cathode.</w:t>
       </w:r>
     </w:p>
     <w:p>

</xml_diff>

<commit_message>
Fix unreadable figures: clip margins and 3→2 panel Stage 3
- plot_results.py: add subplots_adjust(left=0.14) in plot_flux_profiles()
  to prevent the y-axis label 'Current density' being clipped on the left
- run_stage3.py: reduce Stage 3 figure from 3 panels at 9.75" to 2 panels
  at 6.5" (matches all other chapter figures); drops the middle O2 partial
  pressure diagnostic panel so text is legible when inserted in the docx
- Regenerated stage1_flux_profiles.png and stage3_results.png
- Updated Python_for_Multiphysics_Outline_edited.docx with new figures

https://claude.ai/code/session_012yGGMV6iaXGRq7okqrxmoY
</commit_message>
<xml_diff>
--- a/Python_for_Multiphysics_Outline_edited.docx
+++ b/Python_for_Multiphysics_Outline_edited.docx
@@ -19314,8 +19314,8 @@
       <w:r>
         <w:drawing>
           <wp:inline xmlns:a="http://schemas.openxmlformats.org/drawingml/2006/main" xmlns:pic="http://schemas.openxmlformats.org/drawingml/2006/picture">
-            <wp:extent cx="5029200" cy="1882533"/>
-            <wp:docPr id="909377633" name="Picture 909377633"/>
+            <wp:extent cx="5029200" cy="1837348"/>
+            <wp:docPr id="909377637" name="Picture 909377637"/>
             <wp:cNvGraphicFramePr>
               <a:graphicFrameLocks noChangeAspect="1"/>
             </wp:cNvGraphicFramePr>
@@ -19327,7 +19327,7 @@
                     <pic:cNvPicPr/>
                   </pic:nvPicPr>
                   <pic:blipFill>
-                    <a:blip r:embed="rId17"/>
+                    <a:blip r:embed="rId21"/>
                     <a:stretch>
                       <a:fillRect/>
                     </a:stretch>
@@ -19335,7 +19335,7 @@
                   <pic:spPr>
                     <a:xfrm>
                       <a:off x="0" y="0"/>
-                      <a:ext cx="5029200" cy="1882533"/>
+                      <a:ext cx="5029200" cy="1837348"/>
                     </a:xfrm>
                     <a:prstGeom prst="rect"/>
                   </pic:spPr>
@@ -19365,8 +19365,8 @@
       <w:r>
         <w:drawing>
           <wp:inline xmlns:a="http://schemas.openxmlformats.org/drawingml/2006/main" xmlns:pic="http://schemas.openxmlformats.org/drawingml/2006/picture">
-            <wp:extent cx="5029200" cy="1579795"/>
-            <wp:docPr id="909377632" name="Picture 909377632"/>
+            <wp:extent cx="5029200" cy="1795255"/>
+            <wp:docPr id="909377638" name="Picture 909377638"/>
             <wp:cNvGraphicFramePr>
               <a:graphicFrameLocks noChangeAspect="1"/>
             </wp:cNvGraphicFramePr>
@@ -19378,7 +19378,7 @@
                     <pic:cNvPicPr/>
                   </pic:nvPicPr>
                   <pic:blipFill>
-                    <a:blip r:embed="rId16"/>
+                    <a:blip r:embed="rId22"/>
                     <a:stretch>
                       <a:fillRect/>
                     </a:stretch>
@@ -19386,7 +19386,7 @@
                   <pic:spPr>
                     <a:xfrm>
                       <a:off x="0" y="0"/>
-                      <a:ext cx="5029200" cy="1579795"/>
+                      <a:ext cx="5029200" cy="1795255"/>
                     </a:xfrm>
                     <a:prstGeom prst="rect"/>
                   </pic:spPr>

</xml_diff>

<commit_message>
Make flux profiles and Stage 3 figures taller and readable
Switch both from stacked 1-col layout (6.5"x2.5", ~1.25" per panel)
to side-by-side 2-col layout (6.5"x3.5") matching plot_ir_breakdown.
Bump ticklabel_size 7→8. Regenerated both PNGs and updated docx.

https://claude.ai/code/session_012yGGMV6iaXGRq7okqrxmoY
</commit_message>
<xml_diff>
--- a/Python_for_Multiphysics_Outline_edited.docx
+++ b/Python_for_Multiphysics_Outline_edited.docx
@@ -19314,8 +19314,8 @@
       <w:r>
         <w:drawing>
           <wp:inline xmlns:a="http://schemas.openxmlformats.org/drawingml/2006/main" xmlns:pic="http://schemas.openxmlformats.org/drawingml/2006/picture">
-            <wp:extent cx="5029200" cy="1837348"/>
-            <wp:docPr id="909377637" name="Picture 909377637"/>
+            <wp:extent cx="5029200" cy="2773466"/>
+            <wp:docPr id="909377639" name="Picture 909377639"/>
             <wp:cNvGraphicFramePr>
               <a:graphicFrameLocks noChangeAspect="1"/>
             </wp:cNvGraphicFramePr>
@@ -19327,7 +19327,7 @@
                     <pic:cNvPicPr/>
                   </pic:nvPicPr>
                   <pic:blipFill>
-                    <a:blip r:embed="rId21"/>
+                    <a:blip r:embed="rId23"/>
                     <a:stretch>
                       <a:fillRect/>
                     </a:stretch>
@@ -19335,7 +19335,7 @@
                   <pic:spPr>
                     <a:xfrm>
                       <a:off x="0" y="0"/>
-                      <a:ext cx="5029200" cy="1837348"/>
+                      <a:ext cx="5029200" cy="2773466"/>
                     </a:xfrm>
                     <a:prstGeom prst="rect"/>
                   </pic:spPr>
@@ -19365,8 +19365,8 @@
       <w:r>
         <w:drawing>
           <wp:inline xmlns:a="http://schemas.openxmlformats.org/drawingml/2006/main" xmlns:pic="http://schemas.openxmlformats.org/drawingml/2006/picture">
-            <wp:extent cx="5029200" cy="1795255"/>
-            <wp:docPr id="909377638" name="Picture 909377638"/>
+            <wp:extent cx="5029200" cy="2711302"/>
+            <wp:docPr id="909377640" name="Picture 909377640"/>
             <wp:cNvGraphicFramePr>
               <a:graphicFrameLocks noChangeAspect="1"/>
             </wp:cNvGraphicFramePr>
@@ -19378,7 +19378,7 @@
                     <pic:cNvPicPr/>
                   </pic:nvPicPr>
                   <pic:blipFill>
-                    <a:blip r:embed="rId22"/>
+                    <a:blip r:embed="rId24"/>
                     <a:stretch>
                       <a:fillRect/>
                     </a:stretch>
@@ -19386,7 +19386,7 @@
                   <pic:spPr>
                     <a:xfrm>
                       <a:off x="0" y="0"/>
-                      <a:ext cx="5029200" cy="1795255"/>
+                      <a:ext cx="5029200" cy="2711302"/>
                     </a:xfrm>
                     <a:prstGeom prst="rect"/>
                   </pic:spPr>

</xml_diff>